<commit_message>
docs: replace legacy route diagram and name GEP annex
</commit_message>
<xml_diff>
--- a/docs/projects/haidian_gep_xuannv_application_formal_template_20260729_zh.docx
+++ b/docs/projects/haidian_gep_xuannv_application_formal_template_20260729_zh.docx
@@ -2137,6 +2137,163 @@
               <w:t>图1 技术路线：多源遥感与生态辅助数据经质量控制和时空对齐后，形成月度生态状态基础产品；以生态斑块、子汇水区和绿地影响范围为过程单元，开展三类服务实物量核算、独立验证和标准化价值量计算，最终形成试点报告、专题图和核算辅助工具。</w:t>
             </w:r>
           </w:p>
+          <w:p>
+            <w:pPr>
+              <w:spacing w:after="60" w:line="300" w:lineRule="auto"/>
+              <w:jc w:val="left"/>
+            </w:pPr>
+            <w:r>
+              <w:rPr>
+                <w:rFonts w:ascii="Times New Roman" w:hAnsi="Times New Roman" w:eastAsia="宋体"/>
+                <w:b/>
+                <w:sz w:val="21"/>
+              </w:rPr>
+              <w:t>技术路线图</w:t>
+            </w:r>
+          </w:p>
+          <w:tbl>
+            <w:tblPr>
+              <w:tblW w:type="auto" w:w="0"/>
+              <w:tblLook w:firstColumn="1" w:firstRow="1" w:lastColumn="0" w:lastRow="0" w:noHBand="0" w:noVBand="1" w:val="04A0"/>
+            </w:tblPr>
+            <w:tblGrid>
+              <w:gridCol w:w="1510"/>
+              <w:gridCol w:w="1510"/>
+              <w:gridCol w:w="1510"/>
+              <w:gridCol w:w="1510"/>
+              <w:gridCol w:w="1510"/>
+              <w:gridCol w:w="1510"/>
+            </w:tblGrid>
+            <w:tr>
+              <w:tc>
+                <w:tcPr>
+                  <w:tcW w:type="dxa" w:w="1510"/>
+                  <w:shd w:fill="F2F2F2"/>
+                </w:tcPr>
+                <w:p>
+                  <w:pPr>
+                    <w:spacing w:after="0" w:line="264" w:lineRule="auto"/>
+                    <w:jc w:val="center"/>
+                  </w:pPr>
+                  <w:r/>
+                  <w:r>
+                    <w:rPr>
+                      <w:rFonts w:ascii="Times New Roman" w:hAnsi="Times New Roman" w:eastAsia="宋体"/>
+                      <w:b/>
+                      <w:sz w:val="21"/>
+                    </w:rPr>
+                    <w:t>多源遥感与生态辅助数据</w:t>
+                  </w:r>
+                </w:p>
+              </w:tc>
+              <w:tc>
+                <w:tcPr>
+                  <w:tcW w:type="dxa" w:w="1510"/>
+                  <w:shd w:fill="F2F2F2"/>
+                </w:tcPr>
+                <w:p>
+                  <w:pPr>
+                    <w:spacing w:after="0" w:line="264" w:lineRule="auto"/>
+                    <w:jc w:val="center"/>
+                  </w:pPr>
+                  <w:r/>
+                  <w:r>
+                    <w:rPr>
+                      <w:rFonts w:ascii="Times New Roman" w:hAnsi="Times New Roman" w:eastAsia="宋体"/>
+                      <w:b/>
+                      <w:sz w:val="21"/>
+                    </w:rPr>
+                    <w:t>质量控制与时空对齐</w:t>
+                  </w:r>
+                </w:p>
+              </w:tc>
+              <w:tc>
+                <w:tcPr>
+                  <w:tcW w:type="dxa" w:w="1510"/>
+                  <w:shd w:fill="F2F2F2"/>
+                </w:tcPr>
+                <w:p>
+                  <w:pPr>
+                    <w:spacing w:after="0" w:line="264" w:lineRule="auto"/>
+                    <w:jc w:val="center"/>
+                  </w:pPr>
+                  <w:r/>
+                  <w:r>
+                    <w:rPr>
+                      <w:rFonts w:ascii="Times New Roman" w:hAnsi="Times New Roman" w:eastAsia="宋体"/>
+                      <w:b/>
+                      <w:sz w:val="21"/>
+                    </w:rPr>
+                    <w:t>月度生态状态基础产品</w:t>
+                  </w:r>
+                </w:p>
+              </w:tc>
+              <w:tc>
+                <w:tcPr>
+                  <w:tcW w:type="dxa" w:w="1510"/>
+                  <w:shd w:fill="F2F2F2"/>
+                </w:tcPr>
+                <w:p>
+                  <w:pPr>
+                    <w:spacing w:after="0" w:line="264" w:lineRule="auto"/>
+                    <w:jc w:val="center"/>
+                  </w:pPr>
+                  <w:r/>
+                  <w:r>
+                    <w:rPr>
+                      <w:rFonts w:ascii="Times New Roman" w:hAnsi="Times New Roman" w:eastAsia="宋体"/>
+                      <w:b/>
+                      <w:sz w:val="21"/>
+                    </w:rPr>
+                    <w:t>过程单元核算与独立验证</w:t>
+                  </w:r>
+                </w:p>
+              </w:tc>
+              <w:tc>
+                <w:tcPr>
+                  <w:tcW w:type="dxa" w:w="1510"/>
+                  <w:shd w:fill="F2F2F2"/>
+                </w:tcPr>
+                <w:p>
+                  <w:pPr>
+                    <w:spacing w:after="0" w:line="264" w:lineRule="auto"/>
+                    <w:jc w:val="center"/>
+                  </w:pPr>
+                  <w:r/>
+                  <w:r>
+                    <w:rPr>
+                      <w:rFonts w:ascii="Times New Roman" w:hAnsi="Times New Roman" w:eastAsia="宋体"/>
+                      <w:b/>
+                      <w:sz w:val="21"/>
+                    </w:rPr>
+                    <w:t>标准价值量核算</w:t>
+                  </w:r>
+                </w:p>
+              </w:tc>
+              <w:tc>
+                <w:tcPr>
+                  <w:tcW w:type="dxa" w:w="1510"/>
+                  <w:shd w:fill="F2F2F2"/>
+                </w:tcPr>
+                <w:p>
+                  <w:pPr>
+                    <w:spacing w:after="0" w:line="264" w:lineRule="auto"/>
+                    <w:jc w:val="center"/>
+                  </w:pPr>
+                  <w:r/>
+                  <w:r>
+                    <w:rPr>
+                      <w:rFonts w:ascii="Times New Roman" w:hAnsi="Times New Roman" w:eastAsia="宋体"/>
+                      <w:b/>
+                      <w:sz w:val="21"/>
+                    </w:rPr>
+                    <w:t>试点报告、专题图与核算工具</w:t>
+                  </w:r>
+                </w:p>
+              </w:tc>
+            </w:tr>
+          </w:tbl>
+          <w:p/>
         </w:tc>
       </w:tr>
     </w:tbl>

</xml_diff>

<commit_message>
docs: fix GEP annex thresholds and template artifact
</commit_message>
<xml_diff>
--- a/docs/projects/haidian_gep_xuannv_application_formal_template_20260729_zh.docx
+++ b/docs/projects/haidian_gep_xuannv_application_formal_template_20260729_zh.docx
@@ -185,7 +185,8 @@
     </w:p>
     <w:p>
       <w:pPr>
-        <w:spacing w:line="360" w:lineRule="auto"/>
+        <w:spacing w:line="300" w:lineRule="auto" w:after="60"/>
+        <w:jc w:val="left"/>
         <w:rPr>
           <w:rFonts w:ascii="Calibri" w:hAnsi="Calibri" w:eastAsia="宋体" w:cs="Times New Roman"/>
           <w:sz w:val="30"/>
@@ -193,18 +194,11 @@
       </w:pPr>
       <w:r>
         <w:rPr>
-          <w:rFonts w:hint="eastAsia" w:ascii="Calibri" w:hAnsi="Calibri" w:eastAsia="宋体" w:cs="Times New Roman"/>
-          <w:b/>
-          <w:sz w:val="32"/>
+          <w:rFonts w:ascii="Times New Roman" w:hAnsi="Times New Roman" w:eastAsia="宋体"/>
+          <w:b w:val="0"/>
+          <w:sz w:val="24"/>
         </w:rPr>
-        <w:t xml:space="preserve">    预计研究时间：</w:t>
-      </w:r>
-      <w:r>
-        <w:rPr>
-          <w:rFonts w:hint="eastAsia" w:ascii="Calibri" w:hAnsi="Calibri" w:eastAsia="宋体" w:cs="Times New Roman"/>
-          <w:sz w:val="30"/>
-        </w:rPr>
-        <w:t xml:space="preserve">      年  月  日 至    年  月  日</w:t>
+        <w:t>预计研究时间：2026年9月1日 至 2028年8月31日</w:t>
       </w:r>
     </w:p>
     <w:p>
@@ -253,7 +247,8 @@
     </w:p>
     <w:p>
       <w:pPr>
-        <w:jc w:val="center"/>
+        <w:spacing w:after="60" w:line="300" w:lineRule="auto"/>
+        <w:jc w:val="left"/>
         <w:rPr>
           <w:rFonts w:ascii="Calibri" w:hAnsi="Calibri" w:eastAsia="宋体" w:cs="Times New Roman"/>
           <w:b/>
@@ -262,11 +257,11 @@
       </w:pPr>
       <w:r>
         <w:rPr>
-          <w:rFonts w:hint="eastAsia" w:ascii="Calibri" w:hAnsi="Calibri" w:eastAsia="宋体" w:cs="Times New Roman"/>
-          <w:b/>
-          <w:sz w:val="32"/>
+          <w:rFonts w:ascii="Times New Roman" w:hAnsi="Times New Roman" w:eastAsia="宋体"/>
+          <w:b w:val="0"/>
+          <w:sz w:val="24"/>
         </w:rPr>
-        <w:t>二○    年    月</w:t>
+        <w:t>二〇二六年七月</w:t>
       </w:r>
     </w:p>
     <w:p>
@@ -865,7 +860,7 @@
                 <w:b w:val="0"/>
                 <w:sz w:val="21"/>
               </w:rPr>
-              <w:t>数据台账、三类调节服务价值试点、核算辅助工具、试点报告与技术附件。</w:t>
+              <w:t>主要科技成果及形式：数据台账、三类调节服务价值试点、核算辅助工具、试点报告与技术附件。</w:t>
             </w:r>
           </w:p>
         </w:tc>
@@ -930,7 +925,7 @@
                 <w:b w:val="0"/>
                 <w:sz w:val="21"/>
               </w:rPr>
-              <w:t>月度地理嵌入与服务专题模型协同；标准化实物量与价值量核算；可追溯核算辅助工具。</w:t>
+              <w:t>重点技术突破及产品：月度地理嵌入与服务专题模型协同；标准化实物量与价值量核算；可追溯核算辅助工具。</w:t>
             </w:r>
           </w:p>
         </w:tc>
@@ -995,7 +990,7 @@
                 <w:b w:val="0"/>
                 <w:sz w:val="21"/>
               </w:rPr>
-              <w:t>支撑海淀区生态空间监测、服务核算、年度更新和结果复核，提升数据整理和成果审查效率。</w:t>
+              <w:t>效益预期：支撑海淀区生态空间监测、服务核算、年度更新和结果复核，提升数据整理和成果审查效率。</w:t>
             </w:r>
           </w:p>
         </w:tc>

</xml_diff>